<commit_message>
Author block: remove Shakila Shaikh (3 authors, not 4), update Swarnalata's email to real NMIMS address
</commit_message>
<xml_diff>
--- a/EBA-FFD_ICECCE2026_Paper.docx
+++ b/EBA-FFD_ICECCE2026_Paper.docx
@@ -32,13 +32,14 @@
         </w:tblBorders>
       </w:tblPr>
       <w:tblGrid>
-        <w:gridCol w:w="4860"/>
-        <w:gridCol w:w="4860"/>
+        <w:gridCol w:w="3240"/>
+        <w:gridCol w:w="3240"/>
+        <w:gridCol w:w="3240"/>
       </w:tblGrid>
       <w:tr>
         <w:tc>
           <w:tcPr>
-            <w:tcW w:type="dxa" w:w="4860"/>
+            <w:tcW w:type="dxa" w:w="3240"/>
             <w:tcBorders>
               <w:top w:val="none"/>
               <w:left w:val="none"/>
@@ -106,7 +107,7 @@
         </w:tc>
         <w:tc>
           <w:tcPr>
-            <w:tcW w:type="dxa" w:w="4860"/>
+            <w:tcW w:type="dxa" w:w="3240"/>
             <w:tcBorders>
               <w:top w:val="none"/>
               <w:left w:val="none"/>
@@ -172,11 +173,9 @@
             </w:r>
           </w:p>
         </w:tc>
-      </w:tr>
-      <w:tr>
-        <w:tc>
-          <w:tcPr>
-            <w:tcW w:type="dxa" w:w="4860"/>
+        <w:tc>
+          <w:tcPr>
+            <w:tcW w:type="dxa" w:w="3240"/>
             <w:tcBorders>
               <w:top w:val="none"/>
               <w:left w:val="none"/>
@@ -238,75 +237,7 @@
                 <w:sz w:val="18"/>
                 <w:szCs w:val="18"/>
               </w:rPr>
-              <w:t xml:space="preserve">Swarnalata.bollavarapu@placeholder.com</w:t>
-            </w:r>
-          </w:p>
-        </w:tc>
-        <w:tc>
-          <w:tcPr>
-            <w:tcW w:type="dxa" w:w="4860"/>
-            <w:tcBorders>
-              <w:top w:val="none"/>
-              <w:left w:val="none"/>
-              <w:bottom w:val="none"/>
-              <w:right w:val="none"/>
-            </w:tcBorders>
-            <w:tcMar>
-              <w:top w:type="dxa" w:w="60"/>
-              <w:left w:type="dxa" w:w="60"/>
-              <w:bottom w:type="dxa" w:w="60"/>
-              <w:right w:type="dxa" w:w="60"/>
-            </w:tcMar>
-          </w:tcPr>
-          <w:p>
-            <w:pPr>
-              <w:spacing w:after="40"/>
-              <w:jc w:val="center"/>
-            </w:pPr>
-            <w:r>
-              <w:rPr>
-                <w:rFonts w:ascii="Times New Roman" w:cs="Times New Roman" w:eastAsia="Times New Roman" w:hAnsi="Times New Roman"/>
-                <w:b/>
-                <w:bCs/>
-                <w:sz w:val="20"/>
-                <w:szCs w:val="20"/>
-              </w:rPr>
-              <w:t xml:space="preserve">4th Shakila Shaikh</w:t>
-            </w:r>
-            <w:r>
-              <w:br/>
-            </w:r>
-            <w:r>
-              <w:rPr>
-                <w:rFonts w:ascii="Times New Roman" w:cs="Times New Roman" w:eastAsia="Times New Roman" w:hAnsi="Times New Roman"/>
-                <w:i/>
-                <w:iCs/>
-                <w:sz w:val="18"/>
-                <w:szCs w:val="18"/>
-              </w:rPr>
-              <w:t xml:space="preserve">Mukesh Patel School of Technology Management &amp; Engineering, SVKM's NMIMS</w:t>
-            </w:r>
-            <w:r>
-              <w:br/>
-            </w:r>
-            <w:r>
-              <w:rPr>
-                <w:rFonts w:ascii="Times New Roman" w:cs="Times New Roman" w:eastAsia="Times New Roman" w:hAnsi="Times New Roman"/>
-                <w:sz w:val="18"/>
-                <w:szCs w:val="18"/>
-              </w:rPr>
-              <w:t xml:space="preserve">Mumbai, India</w:t>
-            </w:r>
-            <w:r>
-              <w:br/>
-            </w:r>
-            <w:r>
-              <w:rPr>
-                <w:rFonts w:ascii="Times New Roman" w:cs="Times New Roman" w:eastAsia="Times New Roman" w:hAnsi="Times New Roman"/>
-                <w:sz w:val="18"/>
-                <w:szCs w:val="18"/>
-              </w:rPr>
-              <w:t xml:space="preserve">shakilashaikh@placeholder.com</w:t>
+              <w:t xml:space="preserve">Swarnalata.B@nmims.edu</w:t>
             </w:r>
           </w:p>
         </w:tc>

</xml_diff>

<commit_message>
Add missing hyperparameters and a code-availability statement
- IV.B now lists the optimizer, learning rate, MLP layer widths/dropout,
  SMOTE/ENN neighbor counts and sampling ratio, and FedProx mu — all
  read directly from config.py/preprocessing.py/model.py, not estimated.
- Added a Code Availability section pointing to the public GitHub repo.

Co-Authored-By: Claude Sonnet 5 <noreply@anthropic.com>
</commit_message>
<xml_diff>
--- a/EBA-FFD_ICECCE2026_Paper.docx
+++ b/EBA-FFD_ICECCE2026_Paper.docx
@@ -916,7 +916,7 @@
       </w:pPr>
       <w:r>
         <w:rPr/>
-        <w:t>Results in Section V are from a full-scale run on a GPU cluster (Altair Access, NVIDIA H100): 100% of the dataset, ten communication rounds, three local epochs per round, three seeds ({42, 43, 44}), and federation sizes of 4, 8, 16, and 32 simulated banks (Dirichlet α = 0.5). Data are split approximately 70% train, 10% validation, and 20% test before any partitioning; the validation and test sets are global, held by the server, and never partitioned to banks. The expected local batch size is 256 (implied by q_k in Table II). Centralized XGBoost uses 300 trees (maximum depth 6, learning rate 0.1, subsample 0.8, column subsample 0.8); local-only XGBoost uses 150 trees (maximum depth 5); logistic regression uses balanced class weights; the non-federated baselines do not use SMOTE and rely on class weighting instead.</w:t>
+        <w:t>Results in Section V are from a full-scale run on a GPU cluster (Altair Access, NVIDIA H100): 100% of the dataset, ten communication rounds, three local epochs per round, three seeds ({42, 43, 44}), and federation sizes of 4, 8, 16, and 32 simulated banks (Dirichlet α = 0.5). Data are split approximately 70% train, 10% validation, and 20% test before any partitioning; the validation and test sets are global, held by the server, and never partitioned to banks. The expected local batch size is 256 (implied by q_k in Table II). Centralized XGBoost uses 300 trees (maximum depth 6, learning rate 0.1, subsample 0.8, column subsample 0.8); local-only XGBoost uses 150 trees (maximum depth 5); logistic regression uses balanced class weights; the non-federated baselines do not use SMOTE and rely on class weighting instead. EBA-FFD's MLP is trained with AdamW (learning rate 1e-3, weight decay 1e-4) and consists of a 30-128-64-1 fully connected stack with ReLU activations and dropout (0.3 after the first hidden layer, 0.15 after the second). KMeans-SMOTE/SMOTE use k = 5 neighbors and a target minority ratio (sampling_strategy) of 0.3; the ENN cleaning pass uses 3 neighbors. FedProx, where used, sets the proximal-term weight μ = 0.01.</w:t>
       </w:r>
     </w:p>
     <w:p>
@@ -7608,6 +7608,34 @@
       <w:r>
         <w:rPr/>
         <w:t>The authors thank the institution's GPU computing facility for providing access to the NVIDIA H100 cluster (via Altair Access) used for the full-scale evaluation reported in this paper.</w:t>
+      </w:r>
+    </w:p>
+    <w:p>
+      <w:pPr>
+        <w:pStyle w:val="Normal"/>
+        <w:spacing w:before="200" w:after="80"/>
+        <w:rPr/>
+      </w:pPr>
+      <w:r>
+        <w:rPr>
+          <w:b/>
+          <w:bCs/>
+          <w:i/>
+          <w:iCs/>
+        </w:rPr>
+        <w:t>Code Availability</w:t>
+      </w:r>
+    </w:p>
+    <w:p>
+      <w:pPr>
+        <w:pStyle w:val="Normal"/>
+        <w:spacing w:before="0" w:after="200"/>
+        <w:jc w:val="both"/>
+        <w:rPr/>
+      </w:pPr>
+      <w:r>
+        <w:rPr/>
+        <w:t>Code and configuration for EBA-FFD, including the exact hyperparameters above, are publicly available at https://github.com/coding-shlok/EBA_FFD.</w:t>
       </w:r>
     </w:p>
     <w:p>

</xml_diff>

<commit_message>
Add Algorithm 1 and the aggregation/trust equations to III.6 (red text)
Formalizes the adaptive aggregation rule that was previously only
described in prose: Eq. (1) the trust-weighted aggregation formula,
Eq. (2) the trust-score definition, and Algorithm 1 (10-line pseudocode)
tying both together with the Page-Hinkley statistic. No numbers changed
and no other text touched -- inserted as five new paragraphs right after
the existing III.6 prose, in red so the addition is easy to spot for
review before finalizing.

Co-Authored-By: Claude Sonnet 5 <noreply@anthropic.com>
</commit_message>
<xml_diff>
--- a/EBA-FFD_ICECCE2026_Paper.docx
+++ b/EBA-FFD_ICECCE2026_Paper.docx
@@ -354,6 +354,147 @@
       </w:pPr>
       <w:r>
         <w:t>Each client's mean local training loss is fed into a per-client PH statistic [19]. A client whose cumulative deviation from its running mean loss exceeds a threshold (PH tolerance 0.005, threshold 0.05, forgetting factor 0.9999) is flagged as drifting, and its aggregation weight is scaled by a trust factor that decays smoothly with drift severity (steepness β = 2.0) but never falls below a floor (trust_min = 0.20). With every client's trust fixed at 1.0, this rule reduces exactly to vanilla FedAvg, which is therefore both the no-adaptation ablation arm and an independent baseline.</w:t>
+      </w:r>
+    </w:p>
+    <w:p>
+      <w:pPr/>
+      <w:r>
+        <w:rPr>
+          <w:color w:val="FF0000"/>
+        </w:rPr>
+        <w:t>The aggregation rule and trust score are defined precisely as follows, and summarized in Algorithm 1.</w:t>
+      </w:r>
+    </w:p>
+    <w:p>
+      <w:pPr>
+        <w:pStyle w:val="equation"/>
+      </w:pPr>
+      <w:r>
+        <w:rPr>
+          <w:color w:val="FF0000"/>
+        </w:rPr>
+        <w:tab/>
+        <w:t>w_{t+1} = Σ_{k=1}^{K} [n_k·τ_k / Σ_j n_j·τ_j] · w_{t+1}^{(k)}</w:t>
+        <w:tab/>
+        <w:t>(1)</w:t>
+      </w:r>
+    </w:p>
+    <w:p>
+      <w:pPr>
+        <w:pStyle w:val="equation"/>
+      </w:pPr>
+      <w:r>
+        <w:rPr>
+          <w:color w:val="FF0000"/>
+        </w:rPr>
+        <w:tab/>
+        <w:t>τ_k = clip(exp(−β · severity_k), τ_min, 1),   severity_k = PH_k / λ</w:t>
+        <w:tab/>
+        <w:t>(2)</w:t>
+      </w:r>
+    </w:p>
+    <w:p>
+      <w:pPr>
+        <w:pStyle w:val="tablecaption"/>
+      </w:pPr>
+      <w:r>
+        <w:rPr>
+          <w:b/>
+          <w:color w:val="FF0000"/>
+        </w:rPr>
+        <w:t>Algorithm 1. EBA-FFD Adaptive Aggregation.</w:t>
+      </w:r>
+    </w:p>
+    <w:p>
+      <w:pPr>
+        <w:ind w:left="360"/>
+      </w:pPr>
+      <w:r>
+        <w:rPr>
+          <w:color w:val="FF0000"/>
+        </w:rPr>
+        <w:t>1: for each round t = 1, ..., T do</w:t>
+      </w:r>
+      <w:r>
+        <w:br/>
+      </w:r>
+      <w:r>
+        <w:rPr>
+          <w:color w:val="FF0000"/>
+        </w:rPr>
+        <w:t>2:     Server broadcasts global weights w_t to all clients</w:t>
+      </w:r>
+      <w:r>
+        <w:br/>
+      </w:r>
+      <w:r>
+        <w:rPr>
+          <w:color w:val="FF0000"/>
+        </w:rPr>
+        <w:t>3:     for each client k = 1, ..., K in parallel do</w:t>
+      </w:r>
+      <w:r>
+        <w:br/>
+      </w:r>
+      <w:r>
+        <w:rPr>
+          <w:color w:val="FF0000"/>
+        </w:rPr>
+        <w:t>4:         Client k runs local DP-SGD training, returning updated weights w_{t+1}^{(k)} and mean local loss ℓ_k</w:t>
+      </w:r>
+      <w:r>
+        <w:br/>
+      </w:r>
+      <w:r>
+        <w:rPr>
+          <w:color w:val="FF0000"/>
+        </w:rPr>
+        <w:t>5:         Client k's Page-Hinkley statistic PH_k is updated from ℓ_k</w:t>
+      </w:r>
+      <w:r>
+        <w:br/>
+      </w:r>
+      <w:r>
+        <w:rPr>
+          <w:color w:val="FF0000"/>
+        </w:rPr>
+        <w:t>6:         severity_k ← PH_k / λ</w:t>
+      </w:r>
+      <w:r>
+        <w:br/>
+      </w:r>
+      <w:r>
+        <w:rPr>
+          <w:color w:val="FF0000"/>
+        </w:rPr>
+        <w:t>7:         τ_k ← clip(exp(−β · severity_k), τ_min, 1)      ⊳ trust score, Eq. (2)</w:t>
+      </w:r>
+      <w:r>
+        <w:br/>
+      </w:r>
+      <w:r>
+        <w:rPr>
+          <w:color w:val="FF0000"/>
+        </w:rPr>
+        <w:t>8:     end for</w:t>
+      </w:r>
+      <w:r>
+        <w:br/>
+      </w:r>
+      <w:r>
+        <w:rPr>
+          <w:color w:val="FF0000"/>
+        </w:rPr>
+        <w:t>9:     Server aggregates: w_{t+1} ← Σ_k [n_k·τ_k / Σ_j n_j·τ_j] · w_{t+1}^{(k)}      ⊳ Eq. (1)</w:t>
+      </w:r>
+      <w:r>
+        <w:br/>
+      </w:r>
+      <w:r>
+        <w:rPr>
+          <w:color w:val="FF0000"/>
+        </w:rPr>
+        <w:t>10: end for</w:t>
       </w:r>
     </w:p>
     <w:p>

</xml_diff>

<commit_message>
Finalize Algorithm 1 / equations: strip red highlight, fix indentation
Removed the review-highlight red color from the five paragraphs added in
the previous commit. Rebuilt the Algorithm 1 pseudocode as ten separate
lines with proper nested indentation (0.25in per level: round loop,
client loop, and the per-client body), instead of one flat paragraph
with line breaks. No wording or numbers changed.

Co-Authored-By: Claude Sonnet 5 <noreply@anthropic.com>
</commit_message>
<xml_diff>
--- a/EBA-FFD_ICECCE2026_Paper.docx
+++ b/EBA-FFD_ICECCE2026_Paper.docx
@@ -359,9 +359,7 @@
     <w:p>
       <w:pPr/>
       <w:r>
-        <w:rPr>
-          <w:color w:val="FF0000"/>
-        </w:rPr>
+        <w:rPr/>
         <w:t>The aggregation rule and trust score are defined precisely as follows, and summarized in Algorithm 1.</w:t>
       </w:r>
     </w:p>
@@ -370,9 +368,7 @@
         <w:pStyle w:val="equation"/>
       </w:pPr>
       <w:r>
-        <w:rPr>
-          <w:color w:val="FF0000"/>
-        </w:rPr>
+        <w:rPr/>
         <w:tab/>
         <w:t>w_{t+1} = Σ_{k=1}^{K} [n_k·τ_k / Σ_j n_j·τ_j] · w_{t+1}^{(k)}</w:t>
         <w:tab/>
@@ -384,9 +380,7 @@
         <w:pStyle w:val="equation"/>
       </w:pPr>
       <w:r>
-        <w:rPr>
-          <w:color w:val="FF0000"/>
-        </w:rPr>
+        <w:rPr/>
         <w:tab/>
         <w:t>τ_k = clip(exp(−β · severity_k), τ_min, 1),   severity_k = PH_k / λ</w:t>
         <w:tab/>
@@ -400,100 +394,97 @@
       <w:r>
         <w:rPr>
           <w:b/>
-          <w:color w:val="FF0000"/>
         </w:rPr>
         <w:t>Algorithm 1. EBA-FFD Adaptive Aggregation.</w:t>
       </w:r>
     </w:p>
     <w:p>
       <w:pPr>
+        <w:spacing w:after="0"/>
         <w:ind w:left="360"/>
       </w:pPr>
       <w:r>
-        <w:rPr>
-          <w:color w:val="FF0000"/>
-        </w:rPr>
-        <w:t>1: for each round t = 1, ..., T do</w:t>
-      </w:r>
-      <w:r>
-        <w:br/>
-      </w:r>
-      <w:r>
-        <w:rPr>
-          <w:color w:val="FF0000"/>
-        </w:rPr>
-        <w:t>2:     Server broadcasts global weights w_t to all clients</w:t>
-      </w:r>
-      <w:r>
-        <w:br/>
-      </w:r>
-      <w:r>
-        <w:rPr>
-          <w:color w:val="FF0000"/>
-        </w:rPr>
-        <w:t>3:     for each client k = 1, ..., K in parallel do</w:t>
-      </w:r>
-      <w:r>
-        <w:br/>
-      </w:r>
-      <w:r>
-        <w:rPr>
-          <w:color w:val="FF0000"/>
-        </w:rPr>
-        <w:t>4:         Client k runs local DP-SGD training, returning updated weights w_{t+1}^{(k)} and mean local loss ℓ_k</w:t>
-      </w:r>
-      <w:r>
-        <w:br/>
-      </w:r>
-      <w:r>
-        <w:rPr>
-          <w:color w:val="FF0000"/>
-        </w:rPr>
-        <w:t>5:         Client k's Page-Hinkley statistic PH_k is updated from ℓ_k</w:t>
-      </w:r>
-      <w:r>
-        <w:br/>
-      </w:r>
-      <w:r>
-        <w:rPr>
-          <w:color w:val="FF0000"/>
-        </w:rPr>
-        <w:t>6:         severity_k ← PH_k / λ</w:t>
-      </w:r>
-      <w:r>
-        <w:br/>
-      </w:r>
-      <w:r>
-        <w:rPr>
-          <w:color w:val="FF0000"/>
-        </w:rPr>
-        <w:t>7:         τ_k ← clip(exp(−β · severity_k), τ_min, 1)      ⊳ trust score, Eq. (2)</w:t>
-      </w:r>
-      <w:r>
-        <w:br/>
-      </w:r>
-      <w:r>
-        <w:rPr>
-          <w:color w:val="FF0000"/>
-        </w:rPr>
-        <w:t>8:     end for</w:t>
-      </w:r>
-      <w:r>
-        <w:br/>
-      </w:r>
-      <w:r>
-        <w:rPr>
-          <w:color w:val="FF0000"/>
-        </w:rPr>
-        <w:t>9:     Server aggregates: w_{t+1} ← Σ_k [n_k·τ_k / Σ_j n_j·τ_j] · w_{t+1}^{(k)}      ⊳ Eq. (1)</w:t>
-      </w:r>
-      <w:r>
-        <w:br/>
-      </w:r>
-      <w:r>
-        <w:rPr>
-          <w:color w:val="FF0000"/>
-        </w:rPr>
+        <w:t>1:  for each round t = 1, ..., T do</w:t>
+      </w:r>
+    </w:p>
+    <w:p>
+      <w:pPr>
+        <w:spacing w:after="0"/>
+        <w:ind w:left="720"/>
+      </w:pPr>
+      <w:r>
+        <w:t>2:      Server broadcasts global weights w_t to all clients</w:t>
+      </w:r>
+    </w:p>
+    <w:p>
+      <w:pPr>
+        <w:spacing w:after="0"/>
+        <w:ind w:left="720"/>
+      </w:pPr>
+      <w:r>
+        <w:t>3:      for each client k = 1, ..., K in parallel do</w:t>
+      </w:r>
+    </w:p>
+    <w:p>
+      <w:pPr>
+        <w:spacing w:after="0"/>
+        <w:ind w:left="1080"/>
+      </w:pPr>
+      <w:r>
+        <w:t>4:          Client k runs local DP-SGD training, returning updated weights w_{t+1}^{(k)} and mean local loss ℓ_k</w:t>
+      </w:r>
+    </w:p>
+    <w:p>
+      <w:pPr>
+        <w:spacing w:after="0"/>
+        <w:ind w:left="1080"/>
+      </w:pPr>
+      <w:r>
+        <w:t>5:          Client k's Page-Hinkley statistic PH_k is updated from ℓ_k</w:t>
+      </w:r>
+    </w:p>
+    <w:p>
+      <w:pPr>
+        <w:spacing w:after="0"/>
+        <w:ind w:left="1080"/>
+      </w:pPr>
+      <w:r>
+        <w:t>6:          severity_k ← PH_k / λ</w:t>
+      </w:r>
+    </w:p>
+    <w:p>
+      <w:pPr>
+        <w:spacing w:after="0"/>
+        <w:ind w:left="1080"/>
+      </w:pPr>
+      <w:r>
+        <w:t>7:          τ_k ← clip(exp(−β · severity_k), τ_min, 1)      ⊳ trust score, Eq. (2)</w:t>
+      </w:r>
+    </w:p>
+    <w:p>
+      <w:pPr>
+        <w:spacing w:after="0"/>
+        <w:ind w:left="720"/>
+      </w:pPr>
+      <w:r>
+        <w:t>8:      end for</w:t>
+      </w:r>
+    </w:p>
+    <w:p>
+      <w:pPr>
+        <w:spacing w:after="0"/>
+        <w:ind w:left="720"/>
+      </w:pPr>
+      <w:r>
+        <w:t>9:      Server aggregates: w_{t+1} ← Σ_k [n_k·τ_k / Σ_j n_j·τ_j] · w_{t+1}^{(k)}      ⊳ Eq. (1)</w:t>
+      </w:r>
+    </w:p>
+    <w:p>
+      <w:pPr>
+        <w:spacing w:after="0"/>
+        <w:ind w:left="360"/>
+      </w:pPr>
+      <w:r>
         <w:t>10: end for</w:t>
       </w:r>
     </w:p>

</xml_diff>

<commit_message>
Fix title/keywords: 'Concept Drift' -> 'Client-Side Label Corruption'
The drift experiment is a deliberate label-flip stress test on one
client, not concept drift in the formal ML sense (a shift in P(Y|X) or
P(X,Y) over time). The body text already correctly distinguishes this
('rather than general concept drift') -- only the title and keywords
overclaimed. Renamed to match what is actually tested; no other text,
tables, or figures changed.

Co-Authored-By: Claude Sonnet 5 <noreply@anthropic.com>
</commit_message>
<xml_diff>
--- a/EBA-FFD_ICECCE2026_Paper.docx
+++ b/EBA-FFD_ICECCE2026_Paper.docx
@@ -7,7 +7,7 @@
         <w:pStyle w:val="papertitle"/>
       </w:pPr>
       <w:r>
-        <w:t>EBA-FFD: Explainable, Balanced and Adaptive Federated Fraud Detection under Differential Privacy and Concept Drift</w:t>
+        <w:t>EBA-FFD: Explainable, Balanced and Adaptive Federated Fraud Detection under Differential Privacy and Client-Side Label Corruption</w:t>
       </w:r>
     </w:p>
     <w:p>
@@ -62,7 +62,7 @@
         <w:t xml:space="preserve">Keywords: </w:t>
       </w:r>
       <w:r>
-        <w:t>federated learning; differential privacy; concept drift; fraud detection; class imbalance; adaptive aggregation; non-IID data</w:t>
+        <w:t>federated learning; differential privacy; label corruption; fraud detection; class imbalance; adaptive aggregation; non-IID data</w:t>
       </w:r>
     </w:p>
     <w:p>

</xml_diff>